<commit_message>
feat documento finalizado - ajuste no UML
</commit_message>
<xml_diff>
--- a/doc/Documentação_NUUH12.docx
+++ b/doc/Documentação_NUUH12.docx
@@ -1949,7 +1949,15 @@
           <w:sz w:val="24"/>
           <w:szCs w:val="24"/>
         </w:rPr>
-        <w:t>15</w:t>
+        <w:t>1</w:t>
+      </w:r>
+      <w:r>
+        <w:rPr>
+          <w:rFonts w:ascii="Arial" w:eastAsia="Arial" w:hAnsi="Arial" w:cs="Arial"/>
+          <w:sz w:val="24"/>
+          <w:szCs w:val="24"/>
+        </w:rPr>
+        <w:t>7</w:t>
       </w:r>
       <w:r>
         <w:rPr>
@@ -2280,7 +2288,23 @@
           <w:sz w:val="24"/>
           <w:szCs w:val="24"/>
         </w:rPr>
-        <w:t xml:space="preserve"> Rodrigues de Amorim; Freitas, </w:t>
+        <w:t xml:space="preserve"> Rodrigues de</w:t>
+      </w:r>
+      <w:r>
+        <w:rPr>
+          <w:rFonts w:ascii="Arial" w:eastAsia="Arial" w:hAnsi="Arial" w:cs="Arial"/>
+          <w:sz w:val="24"/>
+          <w:szCs w:val="24"/>
+        </w:rPr>
+        <w:t xml:space="preserve"> </w:t>
+      </w:r>
+      <w:r>
+        <w:rPr>
+          <w:rFonts w:ascii="Arial" w:eastAsia="Arial" w:hAnsi="Arial" w:cs="Arial"/>
+          <w:sz w:val="24"/>
+          <w:szCs w:val="24"/>
+        </w:rPr>
+        <w:t xml:space="preserve">Amorim; Freitas, </w:t>
       </w:r>
       <w:r>
         <w:rPr>
@@ -2336,7 +2360,32 @@
           <w:sz w:val="24"/>
           <w:szCs w:val="24"/>
         </w:rPr>
-        <w:t xml:space="preserve">. 50 </w:t>
+        <w:t>.</w:t>
+      </w:r>
+      <w:r>
+        <w:rPr>
+          <w:rFonts w:ascii="Arial" w:eastAsia="Arial" w:hAnsi="Arial" w:cs="Arial"/>
+          <w:sz w:val="24"/>
+          <w:szCs w:val="24"/>
+        </w:rPr>
+        <w:t xml:space="preserve"> </w:t>
+      </w:r>
+      <w:proofErr w:type="gramStart"/>
+      <w:r>
+        <w:rPr>
+          <w:rFonts w:ascii="Arial" w:eastAsia="Arial" w:hAnsi="Arial" w:cs="Arial"/>
+          <w:sz w:val="24"/>
+          <w:szCs w:val="24"/>
+        </w:rPr>
+        <w:t>17</w:t>
+      </w:r>
+      <w:r>
+        <w:rPr>
+          <w:rFonts w:ascii="Arial" w:eastAsia="Arial" w:hAnsi="Arial" w:cs="Arial"/>
+          <w:sz w:val="24"/>
+          <w:szCs w:val="24"/>
+        </w:rPr>
+        <w:t xml:space="preserve">  </w:t>
       </w:r>
       <w:proofErr w:type="spellStart"/>
       <w:r>
@@ -2348,6 +2397,7 @@
         <w:t>pages</w:t>
       </w:r>
       <w:proofErr w:type="spellEnd"/>
+      <w:proofErr w:type="gramEnd"/>
       <w:r>
         <w:rPr>
           <w:rFonts w:ascii="Arial" w:eastAsia="Arial" w:hAnsi="Arial" w:cs="Arial"/>
@@ -6098,15 +6148,11 @@
         <w:jc w:val="both"/>
       </w:pPr>
       <w:r>
-        <w:rPr>
-          <w:noProof/>
-          <w:color w:val="FF0000"/>
-        </w:rPr>
         <w:drawing>
-          <wp:inline distT="0" distB="0" distL="0" distR="0" wp14:anchorId="22D44BA6" wp14:editId="5F412ABB">
-            <wp:extent cx="5760085" cy="3301365"/>
-            <wp:effectExtent l="0" t="0" r="0" b="0"/>
-            <wp:docPr id="212150159" name="Imagem 8" descr="Interface gráfica do usuário, Aplicativo&#10;&#10;O conteúdo gerado por IA pode estar incorreto."/>
+          <wp:inline distT="0" distB="0" distL="0" distR="0" wp14:anchorId="314F58D4" wp14:editId="1ECB630C">
+            <wp:extent cx="5760085" cy="3308985"/>
+            <wp:effectExtent l="0" t="0" r="0" b="5715"/>
+            <wp:docPr id="782630413" name="Imagem 1" descr="Diagrama&#10;&#10;O conteúdo gerado por IA pode estar incorreto."/>
             <wp:cNvGraphicFramePr>
               <a:graphicFrameLocks xmlns:a="http://schemas.openxmlformats.org/drawingml/2006/main" noChangeAspect="1"/>
             </wp:cNvGraphicFramePr>
@@ -6114,17 +6160,11 @@
               <a:graphicData uri="http://schemas.openxmlformats.org/drawingml/2006/picture">
                 <pic:pic xmlns:pic="http://schemas.openxmlformats.org/drawingml/2006/picture">
                   <pic:nvPicPr>
-                    <pic:cNvPr id="212150159" name="Imagem 8" descr="Interface gráfica do usuário, Aplicativo&#10;&#10;O conteúdo gerado por IA pode estar incorreto."/>
+                    <pic:cNvPr id="782630413" name="Imagem 1" descr="Diagrama&#10;&#10;O conteúdo gerado por IA pode estar incorreto."/>
                     <pic:cNvPicPr/>
                   </pic:nvPicPr>
                   <pic:blipFill>
-                    <a:blip r:embed="rId10">
-                      <a:extLst>
-                        <a:ext uri="{28A0092B-C50C-407E-A947-70E740481C1C}">
-                          <a14:useLocalDpi xmlns:a14="http://schemas.microsoft.com/office/drawing/2010/main" val="0"/>
-                        </a:ext>
-                      </a:extLst>
-                    </a:blip>
+                    <a:blip r:embed="rId10"/>
                     <a:stretch>
                       <a:fillRect/>
                     </a:stretch>
@@ -6132,7 +6172,7 @@
                   <pic:spPr>
                     <a:xfrm>
                       <a:off x="0" y="0"/>
-                      <a:ext cx="5760085" cy="3301365"/>
+                      <a:ext cx="5760085" cy="3308985"/>
                     </a:xfrm>
                     <a:prstGeom prst="rect">
                       <a:avLst/>
@@ -15053,30 +15093,34 @@
       </w:pPr>
       <w:r>
         <w:rPr>
+          <w:rFonts w:ascii="Arial" w:eastAsia="Arial" w:hAnsi="Arial" w:cs="Arial"/>
           <w:noProof/>
-          <w:sz w:val="18"/>
-          <w:szCs w:val="18"/>
+          <w:color w:val="000000"/>
+          <w:sz w:val="24"/>
+          <w:szCs w:val="24"/>
         </w:rPr>
         <w:drawing>
-          <wp:anchor distT="0" distB="0" distL="114300" distR="114300" simplePos="0" relativeHeight="251669504" behindDoc="0" locked="0" layoutInCell="1" allowOverlap="1" wp14:anchorId="6FC886DF" wp14:editId="56A57BD8">
+          <wp:anchor distT="0" distB="0" distL="114300" distR="114300" simplePos="0" relativeHeight="251669504" behindDoc="0" locked="0" layoutInCell="1" allowOverlap="1" wp14:anchorId="4D878073" wp14:editId="47C8049F">
             <wp:simplePos x="0" y="0"/>
-            <wp:positionH relativeFrom="page">
+            <wp:positionH relativeFrom="margin">
               <wp:align>center</wp:align>
             </wp:positionH>
             <wp:positionV relativeFrom="paragraph">
-              <wp:posOffset>158198</wp:posOffset>
+              <wp:posOffset>335280</wp:posOffset>
             </wp:positionV>
-            <wp:extent cx="6836026" cy="3856024"/>
-            <wp:effectExtent l="0" t="0" r="3175" b="0"/>
+            <wp:extent cx="6750686" cy="2930680"/>
+            <wp:effectExtent l="0" t="0" r="0" b="3175"/>
             <wp:wrapNone/>
-            <wp:docPr id="990709327" name="image55.png" descr="Linha do tempo&#10;&#10;O conteúdo gerado por IA pode estar incorreto."/>
-            <wp:cNvGraphicFramePr/>
+            <wp:docPr id="1643668760" name="Imagem 9" descr="Diagrama&#10;&#10;O conteúdo gerado por IA pode estar incorreto."/>
+            <wp:cNvGraphicFramePr>
+              <a:graphicFrameLocks xmlns:a="http://schemas.openxmlformats.org/drawingml/2006/main" noChangeAspect="1"/>
+            </wp:cNvGraphicFramePr>
             <a:graphic xmlns:a="http://schemas.openxmlformats.org/drawingml/2006/main">
               <a:graphicData uri="http://schemas.openxmlformats.org/drawingml/2006/picture">
                 <pic:pic xmlns:pic="http://schemas.openxmlformats.org/drawingml/2006/picture">
                   <pic:nvPicPr>
-                    <pic:cNvPr id="990709327" name="image55.png" descr="Linha do tempo&#10;&#10;O conteúdo gerado por IA pode estar incorreto."/>
-                    <pic:cNvPicPr preferRelativeResize="0"/>
+                    <pic:cNvPr id="1643668760" name="Imagem 9" descr="Diagrama&#10;&#10;O conteúdo gerado por IA pode estar incorreto."/>
+                    <pic:cNvPicPr/>
                   </pic:nvPicPr>
                   <pic:blipFill>
                     <a:blip r:embed="rId18" cstate="print">
@@ -15086,7 +15130,6 @@
                         </a:ext>
                       </a:extLst>
                     </a:blip>
-                    <a:srcRect/>
                     <a:stretch>
                       <a:fillRect/>
                     </a:stretch>
@@ -15094,12 +15137,11 @@
                   <pic:spPr>
                     <a:xfrm>
                       <a:off x="0" y="0"/>
-                      <a:ext cx="6836026" cy="3856024"/>
+                      <a:ext cx="6750686" cy="2930680"/>
                     </a:xfrm>
                     <a:prstGeom prst="rect">
                       <a:avLst/>
                     </a:prstGeom>
-                    <a:ln/>
                   </pic:spPr>
                 </pic:pic>
               </a:graphicData>
@@ -15268,7 +15310,7 @@
             </wp:anchor>
           </w:drawing>
         </mc:Choice>
-        <mc:Fallback xmlns:cr="http://schemas.microsoft.com/office/comments/2020/reactions" xmlns="http://schemas.microsoft.com/office/tasks/2019/documenttasks" xmlns:dgm="http://schemas.openxmlformats.org/drawingml/2006/diagram" xmlns:lc="http://schemas.openxmlformats.org/drawingml/2006/lockedCanvas" xmlns:c="http://schemas.openxmlformats.org/drawingml/2006/chart" xmlns:pic="http://schemas.openxmlformats.org/drawingml/2006/picture" xmlns:a="http://schemas.openxmlformats.org/drawingml/2006/main" xmlns:sl="http://schemas.openxmlformats.org/schemaLibrary/2006/main">
+        <mc:Fallback xmlns:sl="http://schemas.openxmlformats.org/schemaLibrary/2006/main" xmlns:a="http://schemas.openxmlformats.org/drawingml/2006/main" xmlns:pic="http://schemas.openxmlformats.org/drawingml/2006/picture" xmlns:c="http://schemas.openxmlformats.org/drawingml/2006/chart" xmlns:lc="http://schemas.openxmlformats.org/drawingml/2006/lockedCanvas" xmlns:dgm="http://schemas.openxmlformats.org/drawingml/2006/diagram" xmlns="http://schemas.microsoft.com/office/tasks/2019/documenttasks" xmlns:cr="http://schemas.microsoft.com/office/comments/2020/reactions">
           <w:drawing>
             <wp:anchor allowOverlap="1" behindDoc="0" distB="4294967295" distT="4294967295" distL="114300" distR="114300" hidden="0" layoutInCell="1" locked="0" relativeHeight="0" simplePos="0">
               <wp:simplePos x="0" y="0"/>
@@ -17437,6 +17479,7 @@
   <w:style w:type="character" w:default="1" w:styleId="Fontepargpadro">
     <w:name w:val="Default Paragraph Font"/>
     <w:uiPriority w:val="1"/>
+    <w:semiHidden/>
     <w:unhideWhenUsed/>
   </w:style>
   <w:style w:type="table" w:default="1" w:styleId="Tabelanormal">
@@ -21633,7 +21676,6 @@
       <w:color w:val="0000FF"/>
       <w:sz w:val="18"/>
       <w:szCs w:val="24"/>
-      <w:lang/>
     </w:rPr>
   </w:style>
 </w:styles>

</xml_diff>

<commit_message>
feat finalização e envio da documentação
</commit_message>
<xml_diff>
--- a/doc/Documentação_NUUH12.docx
+++ b/doc/Documentação_NUUH12.docx
@@ -1,6 +1,6 @@
 
 <file path=word/document.xml><?xml version="1.0" encoding="utf-8"?>
-<w:document xmlns:wpc="http://schemas.microsoft.com/office/word/2010/wordprocessingCanvas" xmlns:cx="http://schemas.microsoft.com/office/drawing/2014/chartex" xmlns:cx1="http://schemas.microsoft.com/office/drawing/2015/9/8/chartex" xmlns:cx2="http://schemas.microsoft.com/office/drawing/2015/10/21/chartex" xmlns:cx3="http://schemas.microsoft.com/office/drawing/2016/5/9/chartex" xmlns:cx4="http://schemas.microsoft.com/office/drawing/2016/5/10/chartex" xmlns:cx5="http://schemas.microsoft.com/office/drawing/2016/5/11/chartex" xmlns:cx6="http://schemas.microsoft.com/office/drawing/2016/5/12/chartex" xmlns:cx7="http://schemas.microsoft.com/office/drawing/2016/5/13/chartex" xmlns:cx8="http://schemas.microsoft.com/office/drawing/2016/5/14/chartex" xmlns:mc="http://schemas.openxmlformats.org/markup-compatibility/2006" xmlns:aink="http://schemas.microsoft.com/office/drawing/2016/ink" xmlns:am3d="http://schemas.microsoft.com/office/drawing/2017/model3d" xmlns:o="urn:schemas-microsoft-com:office:office" xmlns:oel="http://schemas.microsoft.com/office/2019/extlst" xmlns:r="http://schemas.openxmlformats.org/officeDocument/2006/relationships" xmlns:m="http://schemas.openxmlformats.org/officeDocument/2006/math" xmlns:v="urn:schemas-microsoft-com:vml" xmlns:wp14="http://schemas.microsoft.com/office/word/2010/wordprocessingDrawing" xmlns:wp="http://schemas.openxmlformats.org/drawingml/2006/wordprocessingDrawing" xmlns:w10="urn:schemas-microsoft-com:office:word" xmlns:w="http://schemas.openxmlformats.org/wordprocessingml/2006/main" xmlns:w14="http://schemas.microsoft.com/office/word/2010/wordml" xmlns:w15="http://schemas.microsoft.com/office/word/2012/wordml" xmlns:w16cex="http://schemas.microsoft.com/office/word/2018/wordml/cex" xmlns:w16cid="http://schemas.microsoft.com/office/word/2016/wordml/cid" xmlns:w16="http://schemas.microsoft.com/office/word/2018/wordml" xmlns:w16du="http://schemas.microsoft.com/office/word/2023/wordml/word16du" xmlns:w16sdtdh="http://schemas.microsoft.com/office/word/2020/wordml/sdtdatahash" xmlns:w16sdtfl="http://schemas.microsoft.com/office/word/2024/wordml/sdtformatlock" xmlns:w16se="http://schemas.microsoft.com/office/word/2015/wordml/symex" xmlns:wpg="http://schemas.microsoft.com/office/word/2010/wordprocessingGroup" xmlns:wpi="http://schemas.microsoft.com/office/word/2010/wordprocessingInk" xmlns:wne="http://schemas.microsoft.com/office/word/2006/wordml" xmlns:wps="http://schemas.microsoft.com/office/word/2010/wordprocessingShape" mc:Ignorable="w14 w15 w16se w16cid w16 w16cex w16sdtdh w16sdtfl w16du wp14">
+<w:document xmlns:wpc="http://schemas.microsoft.com/office/word/2010/wordprocessingCanvas" xmlns:cx="http://schemas.microsoft.com/office/drawing/2014/chartex" xmlns:cx1="http://schemas.microsoft.com/office/drawing/2015/9/8/chartex" xmlns:mc="http://schemas.openxmlformats.org/markup-compatibility/2006" xmlns:o="urn:schemas-microsoft-com:office:office" xmlns:r="http://schemas.openxmlformats.org/officeDocument/2006/relationships" xmlns:m="http://schemas.openxmlformats.org/officeDocument/2006/math" xmlns:v="urn:schemas-microsoft-com:vml" xmlns:wp14="http://schemas.microsoft.com/office/word/2010/wordprocessingDrawing" xmlns:wp="http://schemas.openxmlformats.org/drawingml/2006/wordprocessingDrawing" xmlns:w10="urn:schemas-microsoft-com:office:word" xmlns:w="http://schemas.openxmlformats.org/wordprocessingml/2006/main" xmlns:w14="http://schemas.microsoft.com/office/word/2010/wordml" xmlns:w15="http://schemas.microsoft.com/office/word/2012/wordml" xmlns:w16se="http://schemas.microsoft.com/office/word/2015/wordml/symex" xmlns:wpg="http://schemas.microsoft.com/office/word/2010/wordprocessingGroup" xmlns:wpi="http://schemas.microsoft.com/office/word/2010/wordprocessingInk" xmlns:wne="http://schemas.microsoft.com/office/word/2006/wordml" xmlns:wps="http://schemas.microsoft.com/office/word/2010/wordprocessingShape" mc:Ignorable="w14 w15 w16se wp14">
   <w:body>
     <w:p>
       <w:pPr>
@@ -156,7 +156,7 @@
               </wp:anchor>
             </w:drawing>
           </mc:Choice>
-          <mc:Fallback>
+          <mc:Fallback xmlns:w16sdtfl="http://schemas.microsoft.com/office/word/2024/wordml/sdtformatlock" xmlns:w16sdtdh="http://schemas.microsoft.com/office/word/2020/wordml/sdtdatahash" xmlns:w16du="http://schemas.microsoft.com/office/word/2023/wordml/word16du" xmlns:w16="http://schemas.microsoft.com/office/word/2018/wordml" xmlns:w16cid="http://schemas.microsoft.com/office/word/2016/wordml/cid" xmlns:w16cex="http://schemas.microsoft.com/office/word/2018/wordml/cex" xmlns:oel="http://schemas.microsoft.com/office/2019/extlst" xmlns:am3d="http://schemas.microsoft.com/office/drawing/2017/model3d" xmlns:aink="http://schemas.microsoft.com/office/drawing/2016/ink" xmlns:cx8="http://schemas.microsoft.com/office/drawing/2016/5/14/chartex" xmlns:cx7="http://schemas.microsoft.com/office/drawing/2016/5/13/chartex" xmlns:cx6="http://schemas.microsoft.com/office/drawing/2016/5/12/chartex" xmlns:cx5="http://schemas.microsoft.com/office/drawing/2016/5/11/chartex" xmlns:cx4="http://schemas.microsoft.com/office/drawing/2016/5/10/chartex" xmlns:cx3="http://schemas.microsoft.com/office/drawing/2016/5/9/chartex" xmlns:cx2="http://schemas.microsoft.com/office/drawing/2015/10/21/chartex">
             <w:pict>
               <v:rect w14:anchorId="462755B0" id="Retângulo 90" o:spid="_x0000_s1026" style="position:absolute;left:0;text-align:left;margin-left:140.05pt;margin-top:644pt;width:180.3pt;height:52.35pt;z-index:251659264;visibility:visible;mso-wrap-style:square;mso-wrap-distance-left:9.05pt;mso-wrap-distance-top:0;mso-wrap-distance-right:9.05pt;mso-wrap-distance-bottom:0;mso-position-horizontal:absolute;mso-position-horizontal-relative:text;mso-position-vertical:absolute;mso-position-vertical-relative:text;v-text-anchor:top" o:gfxdata="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" stroked="f">
                 <v:fill opacity="0"/>
@@ -390,7 +390,7 @@
               </wp:anchor>
             </w:drawing>
           </mc:Choice>
-          <mc:Fallback>
+          <mc:Fallback xmlns:w16sdtfl="http://schemas.microsoft.com/office/word/2024/wordml/sdtformatlock" xmlns:w16sdtdh="http://schemas.microsoft.com/office/word/2020/wordml/sdtdatahash" xmlns:w16du="http://schemas.microsoft.com/office/word/2023/wordml/word16du" xmlns:w16="http://schemas.microsoft.com/office/word/2018/wordml" xmlns:w16cid="http://schemas.microsoft.com/office/word/2016/wordml/cid" xmlns:w16cex="http://schemas.microsoft.com/office/word/2018/wordml/cex" xmlns:oel="http://schemas.microsoft.com/office/2019/extlst" xmlns:am3d="http://schemas.microsoft.com/office/drawing/2017/model3d" xmlns:aink="http://schemas.microsoft.com/office/drawing/2016/ink" xmlns:cx8="http://schemas.microsoft.com/office/drawing/2016/5/14/chartex" xmlns:cx7="http://schemas.microsoft.com/office/drawing/2016/5/13/chartex" xmlns:cx6="http://schemas.microsoft.com/office/drawing/2016/5/12/chartex" xmlns:cx5="http://schemas.microsoft.com/office/drawing/2016/5/11/chartex" xmlns:cx4="http://schemas.microsoft.com/office/drawing/2016/5/10/chartex" xmlns:cx3="http://schemas.microsoft.com/office/drawing/2016/5/9/chartex" xmlns:cx2="http://schemas.microsoft.com/office/drawing/2015/10/21/chartex">
             <w:pict>
               <v:rect w14:anchorId="53D0DDFB" id="Retângulo 89" o:spid="_x0000_s1027" style="position:absolute;left:0;text-align:left;margin-left:-48.95pt;margin-top:12pt;width:537pt;height:231.75pt;z-index:251660288;visibility:visible;mso-wrap-style:square;mso-wrap-distance-left:9.05pt;mso-wrap-distance-top:0;mso-wrap-distance-right:9.05pt;mso-wrap-distance-bottom:0;mso-position-horizontal:absolute;mso-position-horizontal-relative:text;mso-position-vertical:absolute;mso-position-vertical-relative:text;v-text-anchor:top" o:gfxdata="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" stroked="f">
                 <v:fill opacity="0"/>
@@ -613,7 +613,7 @@
               </wp:anchor>
             </w:drawing>
           </mc:Choice>
-          <mc:Fallback>
+          <mc:Fallback xmlns:w16sdtfl="http://schemas.microsoft.com/office/word/2024/wordml/sdtformatlock" xmlns:w16sdtdh="http://schemas.microsoft.com/office/word/2020/wordml/sdtdatahash" xmlns:w16du="http://schemas.microsoft.com/office/word/2023/wordml/word16du" xmlns:w16="http://schemas.microsoft.com/office/word/2018/wordml" xmlns:w16cid="http://schemas.microsoft.com/office/word/2016/wordml/cid" xmlns:w16cex="http://schemas.microsoft.com/office/word/2018/wordml/cex" xmlns:oel="http://schemas.microsoft.com/office/2019/extlst" xmlns:am3d="http://schemas.microsoft.com/office/drawing/2017/model3d" xmlns:aink="http://schemas.microsoft.com/office/drawing/2016/ink" xmlns:cx8="http://schemas.microsoft.com/office/drawing/2016/5/14/chartex" xmlns:cx7="http://schemas.microsoft.com/office/drawing/2016/5/13/chartex" xmlns:cx6="http://schemas.microsoft.com/office/drawing/2016/5/12/chartex" xmlns:cx5="http://schemas.microsoft.com/office/drawing/2016/5/11/chartex" xmlns:cx4="http://schemas.microsoft.com/office/drawing/2016/5/10/chartex" xmlns:cx3="http://schemas.microsoft.com/office/drawing/2016/5/9/chartex" xmlns:cx2="http://schemas.microsoft.com/office/drawing/2015/10/21/chartex">
             <w:pict>
               <v:rect w14:anchorId="62EDCCEA" id="Retângulo 92" o:spid="_x0000_s1028" style="position:absolute;left:0;text-align:left;margin-left:-6.7pt;margin-top:8.65pt;width:452.9pt;height:66.1pt;z-index:251661312;visibility:visible;mso-wrap-style:square;mso-wrap-distance-left:9.05pt;mso-wrap-distance-top:0;mso-wrap-distance-right:9.05pt;mso-wrap-distance-bottom:0;mso-position-horizontal:absolute;mso-position-horizontal-relative:text;mso-position-vertical:absolute;mso-position-vertical-relative:text;v-text-anchor:top" o:gfxdata="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" stroked="f">
                 <v:fill opacity="0"/>
@@ -820,7 +820,7 @@
               </wp:anchor>
             </w:drawing>
           </mc:Choice>
-          <mc:Fallback>
+          <mc:Fallback xmlns:w16sdtfl="http://schemas.microsoft.com/office/word/2024/wordml/sdtformatlock" xmlns:w16sdtdh="http://schemas.microsoft.com/office/word/2020/wordml/sdtdatahash" xmlns:w16du="http://schemas.microsoft.com/office/word/2023/wordml/word16du" xmlns:w16="http://schemas.microsoft.com/office/word/2018/wordml" xmlns:w16cid="http://schemas.microsoft.com/office/word/2016/wordml/cid" xmlns:w16cex="http://schemas.microsoft.com/office/word/2018/wordml/cex" xmlns:oel="http://schemas.microsoft.com/office/2019/extlst" xmlns:am3d="http://schemas.microsoft.com/office/drawing/2017/model3d" xmlns:aink="http://schemas.microsoft.com/office/drawing/2016/ink" xmlns:cx8="http://schemas.microsoft.com/office/drawing/2016/5/14/chartex" xmlns:cx7="http://schemas.microsoft.com/office/drawing/2016/5/13/chartex" xmlns:cx6="http://schemas.microsoft.com/office/drawing/2016/5/12/chartex" xmlns:cx5="http://schemas.microsoft.com/office/drawing/2016/5/11/chartex" xmlns:cx4="http://schemas.microsoft.com/office/drawing/2016/5/10/chartex" xmlns:cx3="http://schemas.microsoft.com/office/drawing/2016/5/9/chartex" xmlns:cx2="http://schemas.microsoft.com/office/drawing/2015/10/21/chartex">
             <w:pict>
               <v:rect w14:anchorId="0A7FAF0A" id="Retângulo 91" o:spid="_x0000_s1029" style="position:absolute;left:0;text-align:left;margin-left:31.05pt;margin-top:5pt;width:456.55pt;height:110.2pt;z-index:251662336;visibility:visible;mso-wrap-style:square;mso-wrap-distance-left:9.05pt;mso-wrap-distance-top:0;mso-wrap-distance-right:9.05pt;mso-wrap-distance-bottom:0;mso-position-horizontal:absolute;mso-position-horizontal-relative:text;mso-position-vertical:absolute;mso-position-vertical-relative:text;v-text-anchor:top" o:gfxdata="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" stroked="f">
                 <v:fill opacity="0"/>
@@ -2649,7 +2649,7 @@
           <w:sz w:val="24"/>
           <w:szCs w:val="24"/>
         </w:rPr>
-        <w:t xml:space="preserve"> a delivery management system for </w:t>
+        <w:t xml:space="preserve"> a delivery management system for a </w:t>
       </w:r>
       <w:proofErr w:type="spellStart"/>
       <w:r>
@@ -2658,7 +2658,7 @@
           <w:sz w:val="24"/>
           <w:szCs w:val="24"/>
         </w:rPr>
-        <w:t>a</w:t>
+        <w:t>beverage</w:t>
       </w:r>
       <w:proofErr w:type="spellEnd"/>
       <w:r>
@@ -2676,7 +2676,7 @@
           <w:sz w:val="24"/>
           <w:szCs w:val="24"/>
         </w:rPr>
-        <w:t>beverage</w:t>
+        <w:t>distributor</w:t>
       </w:r>
       <w:proofErr w:type="spellEnd"/>
       <w:r>
@@ -2685,6 +2685,24 @@
           <w:sz w:val="24"/>
           <w:szCs w:val="24"/>
         </w:rPr>
+        <w:t xml:space="preserve">. </w:t>
+      </w:r>
+      <w:proofErr w:type="spellStart"/>
+      <w:r>
+        <w:rPr>
+          <w:rFonts w:ascii="Arial" w:eastAsia="Arial" w:hAnsi="Arial" w:cs="Arial"/>
+          <w:sz w:val="24"/>
+          <w:szCs w:val="24"/>
+        </w:rPr>
+        <w:t>This</w:t>
+      </w:r>
+      <w:proofErr w:type="spellEnd"/>
+      <w:r>
+        <w:rPr>
+          <w:rFonts w:ascii="Arial" w:eastAsia="Arial" w:hAnsi="Arial" w:cs="Arial"/>
+          <w:sz w:val="24"/>
+          <w:szCs w:val="24"/>
+        </w:rPr>
         <w:t xml:space="preserve"> </w:t>
       </w:r>
       <w:proofErr w:type="spellStart"/>
@@ -2694,7 +2712,7 @@
           <w:sz w:val="24"/>
           <w:szCs w:val="24"/>
         </w:rPr>
-        <w:t>distributor</w:t>
+        <w:t>innovative</w:t>
       </w:r>
       <w:proofErr w:type="spellEnd"/>
       <w:r>
@@ -2703,7 +2721,7 @@
           <w:sz w:val="24"/>
           <w:szCs w:val="24"/>
         </w:rPr>
-        <w:t xml:space="preserve">. </w:t>
+        <w:t xml:space="preserve"> </w:t>
       </w:r>
       <w:proofErr w:type="spellStart"/>
       <w:r>
@@ -2712,7 +2730,7 @@
           <w:sz w:val="24"/>
           <w:szCs w:val="24"/>
         </w:rPr>
-        <w:t>This</w:t>
+        <w:t>feature</w:t>
       </w:r>
       <w:proofErr w:type="spellEnd"/>
       <w:r>
@@ -2730,7 +2748,7 @@
           <w:sz w:val="24"/>
           <w:szCs w:val="24"/>
         </w:rPr>
-        <w:t>innovative</w:t>
+        <w:t>will</w:t>
       </w:r>
       <w:proofErr w:type="spellEnd"/>
       <w:r>
@@ -2739,7 +2757,7 @@
           <w:sz w:val="24"/>
           <w:szCs w:val="24"/>
         </w:rPr>
-        <w:t xml:space="preserve"> feature </w:t>
+        <w:t xml:space="preserve"> </w:t>
       </w:r>
       <w:proofErr w:type="spellStart"/>
       <w:r>
@@ -2748,7 +2766,7 @@
           <w:sz w:val="24"/>
           <w:szCs w:val="24"/>
         </w:rPr>
-        <w:t>will</w:t>
+        <w:t>be</w:t>
       </w:r>
       <w:proofErr w:type="spellEnd"/>
       <w:r>
@@ -2766,7 +2784,7 @@
           <w:sz w:val="24"/>
           <w:szCs w:val="24"/>
         </w:rPr>
-        <w:t>be</w:t>
+        <w:t>responsible</w:t>
       </w:r>
       <w:proofErr w:type="spellEnd"/>
       <w:r>
@@ -2775,6 +2793,24 @@
           <w:sz w:val="24"/>
           <w:szCs w:val="24"/>
         </w:rPr>
+        <w:t xml:space="preserve"> for </w:t>
+      </w:r>
+      <w:proofErr w:type="spellStart"/>
+      <w:r>
+        <w:rPr>
+          <w:rFonts w:ascii="Arial" w:eastAsia="Arial" w:hAnsi="Arial" w:cs="Arial"/>
+          <w:sz w:val="24"/>
+          <w:szCs w:val="24"/>
+        </w:rPr>
+        <w:t>managing</w:t>
+      </w:r>
+      <w:proofErr w:type="spellEnd"/>
+      <w:r>
+        <w:rPr>
+          <w:rFonts w:ascii="Arial" w:eastAsia="Arial" w:hAnsi="Arial" w:cs="Arial"/>
+          <w:sz w:val="24"/>
+          <w:szCs w:val="24"/>
+        </w:rPr>
         <w:t xml:space="preserve"> </w:t>
       </w:r>
       <w:proofErr w:type="spellStart"/>
@@ -2784,7 +2820,7 @@
           <w:sz w:val="24"/>
           <w:szCs w:val="24"/>
         </w:rPr>
-        <w:t>responsible</w:t>
+        <w:t>orders</w:t>
       </w:r>
       <w:proofErr w:type="spellEnd"/>
       <w:r>
@@ -2793,7 +2829,7 @@
           <w:sz w:val="24"/>
           <w:szCs w:val="24"/>
         </w:rPr>
-        <w:t xml:space="preserve"> for </w:t>
+        <w:t xml:space="preserve"> </w:t>
       </w:r>
       <w:proofErr w:type="spellStart"/>
       <w:r>
@@ -2802,7 +2838,7 @@
           <w:sz w:val="24"/>
           <w:szCs w:val="24"/>
         </w:rPr>
-        <w:t>managing</w:t>
+        <w:t>placed</w:t>
       </w:r>
       <w:proofErr w:type="spellEnd"/>
       <w:r>
@@ -2811,6 +2847,24 @@
           <w:sz w:val="24"/>
           <w:szCs w:val="24"/>
         </w:rPr>
+        <w:t xml:space="preserve"> online. It </w:t>
+      </w:r>
+      <w:proofErr w:type="spellStart"/>
+      <w:r>
+        <w:rPr>
+          <w:rFonts w:ascii="Arial" w:eastAsia="Arial" w:hAnsi="Arial" w:cs="Arial"/>
+          <w:sz w:val="24"/>
+          <w:szCs w:val="24"/>
+        </w:rPr>
+        <w:t>is</w:t>
+      </w:r>
+      <w:proofErr w:type="spellEnd"/>
+      <w:r>
+        <w:rPr>
+          <w:rFonts w:ascii="Arial" w:eastAsia="Arial" w:hAnsi="Arial" w:cs="Arial"/>
+          <w:sz w:val="24"/>
+          <w:szCs w:val="24"/>
+        </w:rPr>
         <w:t xml:space="preserve"> </w:t>
       </w:r>
       <w:proofErr w:type="spellStart"/>
@@ -2820,7 +2874,7 @@
           <w:sz w:val="24"/>
           <w:szCs w:val="24"/>
         </w:rPr>
-        <w:t>orders</w:t>
+        <w:t>an</w:t>
       </w:r>
       <w:proofErr w:type="spellEnd"/>
       <w:r>
@@ -2838,7 +2892,7 @@
           <w:sz w:val="24"/>
           <w:szCs w:val="24"/>
         </w:rPr>
-        <w:t>placed</w:t>
+        <w:t>essential</w:t>
       </w:r>
       <w:proofErr w:type="spellEnd"/>
       <w:r>
@@ -2847,7 +2901,7 @@
           <w:sz w:val="24"/>
           <w:szCs w:val="24"/>
         </w:rPr>
-        <w:t xml:space="preserve"> online. It </w:t>
+        <w:t xml:space="preserve"> tool for </w:t>
       </w:r>
       <w:proofErr w:type="spellStart"/>
       <w:r>
@@ -2856,7 +2910,7 @@
           <w:sz w:val="24"/>
           <w:szCs w:val="24"/>
         </w:rPr>
-        <w:t>is</w:t>
+        <w:t>anyone</w:t>
       </w:r>
       <w:proofErr w:type="spellEnd"/>
       <w:r>
@@ -2874,7 +2928,7 @@
           <w:sz w:val="24"/>
           <w:szCs w:val="24"/>
         </w:rPr>
-        <w:t>an</w:t>
+        <w:t>looking</w:t>
       </w:r>
       <w:proofErr w:type="spellEnd"/>
       <w:r>
@@ -2892,7 +2946,7 @@
           <w:sz w:val="24"/>
           <w:szCs w:val="24"/>
         </w:rPr>
-        <w:t>essential</w:t>
+        <w:t>to</w:t>
       </w:r>
       <w:proofErr w:type="spellEnd"/>
       <w:r>
@@ -2901,7 +2955,7 @@
           <w:sz w:val="24"/>
           <w:szCs w:val="24"/>
         </w:rPr>
-        <w:t xml:space="preserve"> tool for </w:t>
+        <w:t xml:space="preserve"> </w:t>
       </w:r>
       <w:proofErr w:type="spellStart"/>
       <w:r>
@@ -2910,7 +2964,7 @@
           <w:sz w:val="24"/>
           <w:szCs w:val="24"/>
         </w:rPr>
-        <w:t>anyone</w:t>
+        <w:t>win</w:t>
       </w:r>
       <w:proofErr w:type="spellEnd"/>
       <w:r>
@@ -2919,6 +2973,24 @@
           <w:sz w:val="24"/>
           <w:szCs w:val="24"/>
         </w:rPr>
+        <w:t xml:space="preserve"> new </w:t>
+      </w:r>
+      <w:proofErr w:type="spellStart"/>
+      <w:r>
+        <w:rPr>
+          <w:rFonts w:ascii="Arial" w:eastAsia="Arial" w:hAnsi="Arial" w:cs="Arial"/>
+          <w:sz w:val="24"/>
+          <w:szCs w:val="24"/>
+        </w:rPr>
+        <w:t>customers</w:t>
+      </w:r>
+      <w:proofErr w:type="spellEnd"/>
+      <w:r>
+        <w:rPr>
+          <w:rFonts w:ascii="Arial" w:eastAsia="Arial" w:hAnsi="Arial" w:cs="Arial"/>
+          <w:sz w:val="24"/>
+          <w:szCs w:val="24"/>
+        </w:rPr>
         <w:t xml:space="preserve"> </w:t>
       </w:r>
       <w:proofErr w:type="spellStart"/>
@@ -2928,7 +3000,7 @@
           <w:sz w:val="24"/>
           <w:szCs w:val="24"/>
         </w:rPr>
-        <w:t>looking</w:t>
+        <w:t>and</w:t>
       </w:r>
       <w:proofErr w:type="spellEnd"/>
       <w:r>
@@ -2946,7 +3018,7 @@
           <w:sz w:val="24"/>
           <w:szCs w:val="24"/>
         </w:rPr>
-        <w:t>to</w:t>
+        <w:t>make</w:t>
       </w:r>
       <w:proofErr w:type="spellEnd"/>
       <w:r>
@@ -2955,61 +3027,7 @@
           <w:sz w:val="24"/>
           <w:szCs w:val="24"/>
         </w:rPr>
-        <w:t xml:space="preserve"> </w:t>
-      </w:r>
-      <w:proofErr w:type="spellStart"/>
-      <w:r>
-        <w:rPr>
-          <w:rFonts w:ascii="Arial" w:eastAsia="Arial" w:hAnsi="Arial" w:cs="Arial"/>
-          <w:sz w:val="24"/>
-          <w:szCs w:val="24"/>
-        </w:rPr>
-        <w:t>win</w:t>
-      </w:r>
-      <w:proofErr w:type="spellEnd"/>
-      <w:r>
-        <w:rPr>
-          <w:rFonts w:ascii="Arial" w:eastAsia="Arial" w:hAnsi="Arial" w:cs="Arial"/>
-          <w:sz w:val="24"/>
-          <w:szCs w:val="24"/>
-        </w:rPr>
-        <w:t xml:space="preserve"> new </w:t>
-      </w:r>
-      <w:proofErr w:type="spellStart"/>
-      <w:r>
-        <w:rPr>
-          <w:rFonts w:ascii="Arial" w:eastAsia="Arial" w:hAnsi="Arial" w:cs="Arial"/>
-          <w:sz w:val="24"/>
-          <w:szCs w:val="24"/>
-        </w:rPr>
-        <w:t>customers</w:t>
-      </w:r>
-      <w:proofErr w:type="spellEnd"/>
-      <w:r>
-        <w:rPr>
-          <w:rFonts w:ascii="Arial" w:eastAsia="Arial" w:hAnsi="Arial" w:cs="Arial"/>
-          <w:sz w:val="24"/>
-          <w:szCs w:val="24"/>
-        </w:rPr>
-        <w:t xml:space="preserve"> </w:t>
-      </w:r>
-      <w:proofErr w:type="spellStart"/>
-      <w:r>
-        <w:rPr>
-          <w:rFonts w:ascii="Arial" w:eastAsia="Arial" w:hAnsi="Arial" w:cs="Arial"/>
-          <w:sz w:val="24"/>
-          <w:szCs w:val="24"/>
-        </w:rPr>
-        <w:t>and</w:t>
-      </w:r>
-      <w:proofErr w:type="spellEnd"/>
-      <w:r>
-        <w:rPr>
-          <w:rFonts w:ascii="Arial" w:eastAsia="Arial" w:hAnsi="Arial" w:cs="Arial"/>
-          <w:sz w:val="24"/>
-          <w:szCs w:val="24"/>
-        </w:rPr>
-        <w:t xml:space="preserve"> make more </w:t>
+        <w:t xml:space="preserve"> more </w:t>
       </w:r>
       <w:proofErr w:type="spellStart"/>
       <w:r>
@@ -3675,6 +3693,15 @@
           <w:szCs w:val="24"/>
         </w:rPr>
       </w:pPr>
+      <w:r>
+        <w:rPr>
+          <w:rFonts w:ascii="Arial" w:eastAsia="Arial" w:hAnsi="Arial" w:cs="Arial"/>
+          <w:b/>
+          <w:sz w:val="24"/>
+          <w:szCs w:val="24"/>
+        </w:rPr>
+        <w:t>Key-</w:t>
+      </w:r>
       <w:proofErr w:type="spellStart"/>
       <w:r>
         <w:rPr>
@@ -3683,7 +3710,7 @@
           <w:sz w:val="24"/>
           <w:szCs w:val="24"/>
         </w:rPr>
-        <w:t>Key-words</w:t>
+        <w:t>words</w:t>
       </w:r>
       <w:proofErr w:type="spellEnd"/>
       <w:r>
@@ -3891,6 +3918,7 @@
           <w:docPartUnique/>
         </w:docPartObj>
       </w:sdtPr>
+      <w:sdtEndPr/>
       <w:sdtContent>
         <w:p>
           <w:pPr>
@@ -5652,7 +5680,27 @@
           <w:sz w:val="24"/>
           <w:szCs w:val="24"/>
         </w:rPr>
-        <w:t>RN06. Quanto a erros de finalização de pedidos: Caso ocorra algum erro o sistema deve exibir mensagem.</w:t>
+        <w:t xml:space="preserve">RN06. Quanto a erros de finalização de pedidos: Caso ocorra algum erro o sistema deve exibir </w:t>
+      </w:r>
+      <w:proofErr w:type="spellStart"/>
+      <w:r>
+        <w:rPr>
+          <w:rFonts w:ascii="Arial" w:eastAsia="Arial" w:hAnsi="Arial" w:cs="Arial"/>
+          <w:bCs/>
+          <w:sz w:val="24"/>
+          <w:szCs w:val="24"/>
+        </w:rPr>
+        <w:t>mensagem</w:t>
+      </w:r>
+      <w:proofErr w:type="spellEnd"/>
+      <w:r>
+        <w:rPr>
+          <w:rFonts w:ascii="Arial" w:eastAsia="Arial" w:hAnsi="Arial" w:cs="Arial"/>
+          <w:bCs/>
+          <w:sz w:val="24"/>
+          <w:szCs w:val="24"/>
+        </w:rPr>
+        <w:t>.</w:t>
       </w:r>
     </w:p>
     <w:p>
@@ -5920,7 +5968,25 @@
           <w:sz w:val="24"/>
           <w:szCs w:val="24"/>
         </w:rPr>
-        <w:t>● Manter Menus: permite cadastrar, alterar, listar, ativar e desativar itens do menu (painel administrativo) no sistema.</w:t>
+        <w:t xml:space="preserve">● </w:t>
+      </w:r>
+      <w:r>
+        <w:rPr>
+          <w:rFonts w:ascii="Arial" w:eastAsia="Arial" w:hAnsi="Arial" w:cs="Arial"/>
+          <w:bCs/>
+          <w:sz w:val="24"/>
+          <w:szCs w:val="24"/>
+        </w:rPr>
+        <w:t>Menu</w:t>
+      </w:r>
+      <w:r>
+        <w:rPr>
+          <w:rFonts w:ascii="Arial" w:eastAsia="Arial" w:hAnsi="Arial" w:cs="Arial"/>
+          <w:bCs/>
+          <w:sz w:val="24"/>
+          <w:szCs w:val="24"/>
+        </w:rPr>
+        <w:t>: permite cadastrar, alterar, listar, ativar e desativar itens do menu (painel administrativo) no sistema.</w:t>
       </w:r>
     </w:p>
     <w:p>
@@ -5949,7 +6015,25 @@
           <w:sz w:val="24"/>
           <w:szCs w:val="24"/>
         </w:rPr>
-        <w:t>● Manter Perfis: permite cadastrar, alterar, listar, ativar, desativar perfis de usuários, e vincular e desvincular menus a determinado perfil no sistema.</w:t>
+        <w:t xml:space="preserve">● </w:t>
+      </w:r>
+      <w:r>
+        <w:rPr>
+          <w:rFonts w:ascii="Arial" w:eastAsia="Arial" w:hAnsi="Arial" w:cs="Arial"/>
+          <w:bCs/>
+          <w:sz w:val="24"/>
+          <w:szCs w:val="24"/>
+        </w:rPr>
+        <w:t>Perfil</w:t>
+      </w:r>
+      <w:r>
+        <w:rPr>
+          <w:rFonts w:ascii="Arial" w:eastAsia="Arial" w:hAnsi="Arial" w:cs="Arial"/>
+          <w:bCs/>
+          <w:sz w:val="24"/>
+          <w:szCs w:val="24"/>
+        </w:rPr>
+        <w:t>: permite cadastrar, alterar, listar, ativar, desativar perfis de usuários, e vincular e desvincular menus a determinado perfil no sistema.</w:t>
       </w:r>
     </w:p>
     <w:p>
@@ -5978,7 +6062,27 @@
           <w:sz w:val="24"/>
           <w:szCs w:val="24"/>
         </w:rPr>
-        <w:t xml:space="preserve">● Manter Usuário: permite efetuar login, efetuar </w:t>
+        <w:t xml:space="preserve">● Usuário: permite efetuar </w:t>
+      </w:r>
+      <w:proofErr w:type="spellStart"/>
+      <w:r>
+        <w:rPr>
+          <w:rFonts w:ascii="Arial" w:eastAsia="Arial" w:hAnsi="Arial" w:cs="Arial"/>
+          <w:bCs/>
+          <w:sz w:val="24"/>
+          <w:szCs w:val="24"/>
+        </w:rPr>
+        <w:t>login</w:t>
+      </w:r>
+      <w:proofErr w:type="spellEnd"/>
+      <w:r>
+        <w:rPr>
+          <w:rFonts w:ascii="Arial" w:eastAsia="Arial" w:hAnsi="Arial" w:cs="Arial"/>
+          <w:bCs/>
+          <w:sz w:val="24"/>
+          <w:szCs w:val="24"/>
+        </w:rPr>
+        <w:t xml:space="preserve">, efetuar </w:t>
       </w:r>
       <w:proofErr w:type="spellStart"/>
       <w:r>
@@ -6027,7 +6131,16 @@
           <w:sz w:val="24"/>
           <w:szCs w:val="24"/>
         </w:rPr>
-        <w:t>● Manter Cliente: permite cadastrar, alterar, listar, ativar e desativar clientes no sistema.</w:t>
+        <w:t xml:space="preserve">● </w:t>
+      </w:r>
+      <w:r>
+        <w:rPr>
+          <w:rFonts w:ascii="Arial" w:eastAsia="Arial" w:hAnsi="Arial" w:cs="Arial"/>
+          <w:bCs/>
+          <w:sz w:val="24"/>
+          <w:szCs w:val="24"/>
+        </w:rPr>
+        <w:t>Cliente: permite cadastrar, alterar, listar, ativar e desativar clientes no sistema.</w:t>
       </w:r>
     </w:p>
     <w:p>
@@ -6056,7 +6169,7 @@
           <w:sz w:val="24"/>
           <w:szCs w:val="24"/>
         </w:rPr>
-        <w:t>● Manter Produto: permite cadastrar, alterar, listar, ativar e desativar produto no sistema.</w:t>
+        <w:t>● Produto: permite cadastrar, alterar, listar, ativar e desativar produto no sistema.</w:t>
       </w:r>
     </w:p>
     <w:p>
@@ -6085,7 +6198,7 @@
           <w:sz w:val="24"/>
           <w:szCs w:val="24"/>
         </w:rPr>
-        <w:t xml:space="preserve">● Manter Venda: permite registrar, listar, classificar como entregue e não entregue. </w:t>
+        <w:t xml:space="preserve">● Venda: permite registrar, listar, classificar como entregue e não entregue. </w:t>
       </w:r>
     </w:p>
     <w:p>
@@ -6148,6 +6261,9 @@
         <w:jc w:val="both"/>
       </w:pPr>
       <w:r>
+        <w:rPr>
+          <w:noProof/>
+        </w:rPr>
         <w:drawing>
           <wp:inline distT="0" distB="0" distL="0" distR="0" wp14:anchorId="314F58D4" wp14:editId="1ECB630C">
             <wp:extent cx="5760085" cy="3308985"/>
@@ -6184,6 +6300,21 @@
           </wp:inline>
         </w:drawing>
       </w:r>
+    </w:p>
+    <w:p>
+      <w:pPr>
+        <w:tabs>
+          <w:tab w:val="right" w:pos="9061"/>
+        </w:tabs>
+        <w:spacing w:after="100"/>
+        <w:rPr>
+          <w:rFonts w:ascii="Arial" w:eastAsia="Arial" w:hAnsi="Arial" w:cs="Arial"/>
+          <w:b/>
+          <w:bCs/>
+          <w:sz w:val="24"/>
+          <w:szCs w:val="24"/>
+        </w:rPr>
+      </w:pPr>
     </w:p>
     <w:p>
       <w:pPr>
@@ -7794,7 +7925,6 @@
           <w:sz w:val="24"/>
           <w:szCs w:val="24"/>
         </w:rPr>
-        <w:lastRenderedPageBreak/>
         <w:t>4.3</w:t>
       </w:r>
       <w:r>
@@ -9236,7 +9366,6 @@
           <w:sz w:val="24"/>
           <w:szCs w:val="24"/>
         </w:rPr>
-        <w:lastRenderedPageBreak/>
         <w:t>4.6</w:t>
       </w:r>
       <w:r>
@@ -10722,6 +10851,7 @@
           <w:sz w:val="24"/>
           <w:szCs w:val="24"/>
         </w:rPr>
+        <w:lastRenderedPageBreak/>
         <w:t>O cliente poderá realizar seu cadastro, acessar o catálogo de bebidas disponíveis, escolher seus produtos, selecionar a forma de pagamento e acompanhar o status do pedid</w:t>
       </w:r>
       <w:r>
@@ -10760,7 +10890,6 @@
           <w:sz w:val="24"/>
           <w:szCs w:val="24"/>
         </w:rPr>
-        <w:lastRenderedPageBreak/>
         <w:t>Já o administrador terá controle total sobre os dados de vendas, cadastro de produtos, gestão de clientes, promoções e acompanhamento logístico das entregas. Com isso, o sistema proporcionará uma gestão mais eficiente e estratégica, ampliando a competitividade da empresa no mercado.</w:t>
       </w:r>
     </w:p>
@@ -10957,7 +11086,15 @@
                 <w:sz w:val="24"/>
                 <w:szCs w:val="24"/>
               </w:rPr>
-              <w:t>Cadastro, edição e exclusão de produtos (admin)</w:t>
+              <w:t xml:space="preserve">Cadastro, </w:t>
+            </w:r>
+            <w:r>
+              <w:rPr>
+                <w:rFonts w:ascii="Arial" w:hAnsi="Arial" w:cs="Arial"/>
+                <w:sz w:val="24"/>
+                <w:szCs w:val="24"/>
+              </w:rPr>
+              <w:t>edição e exclusão de produtos (admin)</w:t>
             </w:r>
           </w:p>
           <w:p>
@@ -10982,7 +11119,7 @@
                 <w:sz w:val="24"/>
                 <w:szCs w:val="24"/>
               </w:rPr>
-              <w:t>Gestão de clientes, funcionários e entregadores</w:t>
+              <w:t>Ges</w:t>
             </w:r>
             <w:r>
               <w:rPr>
@@ -10990,7 +11127,33 @@
                 <w:sz w:val="24"/>
                 <w:szCs w:val="24"/>
               </w:rPr>
-              <w:t xml:space="preserve"> (admin)</w:t>
+              <w:t xml:space="preserve">tão de clientes, funcionários </w:t>
+            </w:r>
+            <w:r>
+              <w:rPr>
+                <w:rFonts w:ascii="Arial" w:hAnsi="Arial" w:cs="Arial"/>
+                <w:sz w:val="24"/>
+                <w:szCs w:val="24"/>
+              </w:rPr>
+              <w:t>(</w:t>
+            </w:r>
+            <w:proofErr w:type="spellStart"/>
+            <w:r>
+              <w:rPr>
+                <w:rFonts w:ascii="Arial" w:hAnsi="Arial" w:cs="Arial"/>
+                <w:sz w:val="24"/>
+                <w:szCs w:val="24"/>
+              </w:rPr>
+              <w:t>admin</w:t>
+            </w:r>
+            <w:proofErr w:type="spellEnd"/>
+            <w:r>
+              <w:rPr>
+                <w:rFonts w:ascii="Arial" w:hAnsi="Arial" w:cs="Arial"/>
+                <w:sz w:val="24"/>
+                <w:szCs w:val="24"/>
+              </w:rPr>
+              <w:t>)</w:t>
             </w:r>
           </w:p>
           <w:p>
@@ -11015,7 +11178,33 @@
                 <w:sz w:val="24"/>
                 <w:szCs w:val="24"/>
               </w:rPr>
-              <w:t>Controle de estoque e promoções (admin)</w:t>
+              <w:t xml:space="preserve">Controle de estoque </w:t>
+            </w:r>
+            <w:r>
+              <w:rPr>
+                <w:rFonts w:ascii="Arial" w:hAnsi="Arial" w:cs="Arial"/>
+                <w:sz w:val="24"/>
+                <w:szCs w:val="24"/>
+              </w:rPr>
+              <w:t>(</w:t>
+            </w:r>
+            <w:proofErr w:type="spellStart"/>
+            <w:r>
+              <w:rPr>
+                <w:rFonts w:ascii="Arial" w:hAnsi="Arial" w:cs="Arial"/>
+                <w:sz w:val="24"/>
+                <w:szCs w:val="24"/>
+              </w:rPr>
+              <w:t>admin</w:t>
+            </w:r>
+            <w:proofErr w:type="spellEnd"/>
+            <w:r>
+              <w:rPr>
+                <w:rFonts w:ascii="Arial" w:hAnsi="Arial" w:cs="Arial"/>
+                <w:sz w:val="24"/>
+                <w:szCs w:val="24"/>
+              </w:rPr>
+              <w:t>)</w:t>
             </w:r>
           </w:p>
         </w:tc>
@@ -11926,70 +12115,6 @@
           <w:tab w:val="right" w:pos="9061"/>
         </w:tabs>
         <w:spacing w:after="100"/>
-        <w:jc w:val="both"/>
-        <w:rPr>
-          <w:rFonts w:ascii="Arial" w:eastAsia="Arial" w:hAnsi="Arial" w:cs="Arial"/>
-          <w:sz w:val="24"/>
-          <w:szCs w:val="24"/>
-        </w:rPr>
-      </w:pPr>
-    </w:p>
-    <w:p>
-      <w:pPr>
-        <w:pStyle w:val="PargrafodaLista"/>
-        <w:tabs>
-          <w:tab w:val="right" w:pos="9061"/>
-        </w:tabs>
-        <w:spacing w:after="100"/>
-        <w:ind w:left="468"/>
-        <w:jc w:val="both"/>
-        <w:rPr>
-          <w:rFonts w:ascii="Arial" w:eastAsia="Arial" w:hAnsi="Arial" w:cs="Arial"/>
-          <w:sz w:val="24"/>
-          <w:szCs w:val="24"/>
-        </w:rPr>
-      </w:pPr>
-    </w:p>
-    <w:p>
-      <w:pPr>
-        <w:pStyle w:val="PargrafodaLista"/>
-        <w:tabs>
-          <w:tab w:val="right" w:pos="9061"/>
-        </w:tabs>
-        <w:spacing w:after="100"/>
-        <w:ind w:left="468"/>
-        <w:jc w:val="both"/>
-        <w:rPr>
-          <w:rFonts w:ascii="Arial" w:eastAsia="Arial" w:hAnsi="Arial" w:cs="Arial"/>
-          <w:sz w:val="24"/>
-          <w:szCs w:val="24"/>
-        </w:rPr>
-      </w:pPr>
-    </w:p>
-    <w:p>
-      <w:pPr>
-        <w:pStyle w:val="PargrafodaLista"/>
-        <w:tabs>
-          <w:tab w:val="right" w:pos="9061"/>
-        </w:tabs>
-        <w:spacing w:after="100"/>
-        <w:ind w:left="468"/>
-        <w:jc w:val="both"/>
-        <w:rPr>
-          <w:rFonts w:ascii="Arial" w:eastAsia="Arial" w:hAnsi="Arial" w:cs="Arial"/>
-          <w:sz w:val="24"/>
-          <w:szCs w:val="24"/>
-        </w:rPr>
-      </w:pPr>
-    </w:p>
-    <w:p>
-      <w:pPr>
-        <w:pStyle w:val="PargrafodaLista"/>
-        <w:tabs>
-          <w:tab w:val="right" w:pos="9061"/>
-        </w:tabs>
-        <w:spacing w:after="100"/>
-        <w:ind w:left="468"/>
         <w:jc w:val="both"/>
         <w:rPr>
           <w:rFonts w:ascii="Arial" w:eastAsia="Arial" w:hAnsi="Arial" w:cs="Arial"/>
@@ -12787,7 +12912,6 @@
               </w:rPr>
             </w:pPr>
             <w:proofErr w:type="spellStart"/>
-            <w:proofErr w:type="gramStart"/>
             <w:r>
               <w:rPr>
                 <w:rFonts w:ascii="Arial" w:hAnsi="Arial" w:cs="Arial"/>
@@ -12803,16 +12927,7 @@
                 <w:sz w:val="24"/>
                 <w:szCs w:val="24"/>
               </w:rPr>
-              <w:t>./</w:t>
-            </w:r>
-            <w:proofErr w:type="gramEnd"/>
-            <w:r>
-              <w:rPr>
-                <w:rFonts w:ascii="Arial" w:hAnsi="Arial" w:cs="Arial"/>
-                <w:sz w:val="24"/>
-                <w:szCs w:val="24"/>
-              </w:rPr>
-              <w:t xml:space="preserve"> Profis.</w:t>
+              <w:t>./ Profis.</w:t>
             </w:r>
           </w:p>
         </w:tc>
@@ -13610,7 +13725,7 @@
           <w:sz w:val="24"/>
           <w:szCs w:val="24"/>
         </w:rPr>
-        <w:t>5.2.1 Diagrama de Caso de Uso Manter Perfil</w:t>
+        <w:t>5.2.1 Diagrama de Caso de Uso Perfil</w:t>
       </w:r>
     </w:p>
     <w:p>
@@ -13857,48 +13972,6 @@
     </w:p>
     <w:p>
       <w:pPr>
-        <w:tabs>
-          <w:tab w:val="right" w:pos="9061"/>
-        </w:tabs>
-        <w:spacing w:after="100"/>
-        <w:rPr>
-          <w:rFonts w:ascii="Arial" w:eastAsia="Arial" w:hAnsi="Arial" w:cs="Arial"/>
-          <w:color w:val="000000"/>
-          <w:sz w:val="24"/>
-          <w:szCs w:val="24"/>
-        </w:rPr>
-      </w:pPr>
-    </w:p>
-    <w:p>
-      <w:pPr>
-        <w:tabs>
-          <w:tab w:val="right" w:pos="9061"/>
-        </w:tabs>
-        <w:spacing w:after="100"/>
-        <w:rPr>
-          <w:rFonts w:ascii="Arial" w:eastAsia="Arial" w:hAnsi="Arial" w:cs="Arial"/>
-          <w:color w:val="000000"/>
-          <w:sz w:val="24"/>
-          <w:szCs w:val="24"/>
-        </w:rPr>
-      </w:pPr>
-    </w:p>
-    <w:p>
-      <w:pPr>
-        <w:tabs>
-          <w:tab w:val="right" w:pos="9061"/>
-        </w:tabs>
-        <w:spacing w:after="100"/>
-        <w:rPr>
-          <w:rFonts w:ascii="Arial" w:eastAsia="Arial" w:hAnsi="Arial" w:cs="Arial"/>
-          <w:color w:val="000000"/>
-          <w:sz w:val="24"/>
-          <w:szCs w:val="24"/>
-        </w:rPr>
-      </w:pPr>
-    </w:p>
-    <w:p>
-      <w:pPr>
         <w:keepNext/>
         <w:keepLines/>
         <w:pBdr>
@@ -13945,7 +14018,7 @@
           <w:sz w:val="24"/>
           <w:szCs w:val="24"/>
         </w:rPr>
-        <w:t xml:space="preserve">5.2.2 Diagrama de Caso de Uso Manter </w:t>
+        <w:t xml:space="preserve">5.2.2 Diagrama de Caso de Uso </w:t>
       </w:r>
       <w:bookmarkStart w:id="4" w:name="_heading=h.bmuhjwxdtqmi" w:colFirst="0" w:colLast="0"/>
       <w:bookmarkEnd w:id="4"/>
@@ -14045,7 +14118,25 @@
           <w:sz w:val="24"/>
           <w:szCs w:val="24"/>
         </w:rPr>
-        <w:t>5.2.3 Diagrama de Caso de Uma Manter Usuário</w:t>
+        <w:t xml:space="preserve">5.2.3 Diagrama de Caso de </w:t>
+      </w:r>
+      <w:r>
+        <w:rPr>
+          <w:rFonts w:ascii="Arial" w:eastAsia="Arial" w:hAnsi="Arial" w:cs="Arial"/>
+          <w:bCs/>
+          <w:sz w:val="24"/>
+          <w:szCs w:val="24"/>
+        </w:rPr>
+        <w:t>uso</w:t>
+      </w:r>
+      <w:r>
+        <w:rPr>
+          <w:rFonts w:ascii="Arial" w:eastAsia="Arial" w:hAnsi="Arial" w:cs="Arial"/>
+          <w:bCs/>
+          <w:sz w:val="24"/>
+          <w:szCs w:val="24"/>
+        </w:rPr>
+        <w:t xml:space="preserve"> Usuário</w:t>
       </w:r>
     </w:p>
     <w:p>
@@ -14209,7 +14300,7 @@
           <w:szCs w:val="24"/>
         </w:rPr>
         <w:lastRenderedPageBreak/>
-        <w:t>5.2.4 Diagrama de Caso de Uso Manter Cliente</w:t>
+        <w:t>5.2.4 Diagrama de Caso de Uso Cliente</w:t>
       </w:r>
     </w:p>
     <w:p>
@@ -14495,7 +14586,7 @@
           <w:sz w:val="24"/>
           <w:szCs w:val="24"/>
         </w:rPr>
-        <w:t>5.2.5 Diagrama de Caso de Uso Manter Venda</w:t>
+        <w:t>5.2.5 Diagrama de Caso de Uso Venda</w:t>
       </w:r>
     </w:p>
     <w:p>
@@ -14786,7 +14877,18 @@
           <w:szCs w:val="24"/>
         </w:rPr>
         <w:lastRenderedPageBreak/>
-        <w:t>5.2.6 Diagrama de Caso de Uso Manter Produto</w:t>
+        <w:t xml:space="preserve">5.2.6 Diagrama de Caso de Uso </w:t>
+      </w:r>
+      <w:bookmarkStart w:id="15" w:name="_GoBack"/>
+      <w:bookmarkEnd w:id="15"/>
+      <w:r>
+        <w:rPr>
+          <w:rFonts w:ascii="Arial" w:eastAsia="Arial" w:hAnsi="Arial" w:cs="Arial"/>
+          <w:bCs/>
+          <w:sz w:val="24"/>
+          <w:szCs w:val="24"/>
+        </w:rPr>
+        <w:t>Produto</w:t>
       </w:r>
     </w:p>
     <w:p>
@@ -14796,10 +14898,10 @@
         <w:spacing w:before="200" w:line="360" w:lineRule="auto"/>
         <w:jc w:val="center"/>
       </w:pPr>
-      <w:bookmarkStart w:id="15" w:name="_heading=h.jxcp9euekrfd" w:colFirst="0" w:colLast="0"/>
-      <w:bookmarkStart w:id="16" w:name="_heading=h.23ckvvd" w:colFirst="0" w:colLast="0"/>
-      <w:bookmarkEnd w:id="15"/>
+      <w:bookmarkStart w:id="16" w:name="_heading=h.jxcp9euekrfd" w:colFirst="0" w:colLast="0"/>
+      <w:bookmarkStart w:id="17" w:name="_heading=h.23ckvvd" w:colFirst="0" w:colLast="0"/>
       <w:bookmarkEnd w:id="16"/>
+      <w:bookmarkEnd w:id="17"/>
       <w:r>
         <w:rPr>
           <w:rFonts w:ascii="Arial" w:eastAsia="Arial" w:hAnsi="Arial" w:cs="Arial"/>
@@ -15179,7 +15281,7 @@
 </file>
 
 <file path=word/endnotes.xml><?xml version="1.0" encoding="utf-8"?>
-<w:endnotes xmlns:wpc="http://schemas.microsoft.com/office/word/2010/wordprocessingCanvas" xmlns:cx="http://schemas.microsoft.com/office/drawing/2014/chartex" xmlns:cx1="http://schemas.microsoft.com/office/drawing/2015/9/8/chartex" xmlns:cx2="http://schemas.microsoft.com/office/drawing/2015/10/21/chartex" xmlns:cx3="http://schemas.microsoft.com/office/drawing/2016/5/9/chartex" xmlns:cx4="http://schemas.microsoft.com/office/drawing/2016/5/10/chartex" xmlns:cx5="http://schemas.microsoft.com/office/drawing/2016/5/11/chartex" xmlns:cx6="http://schemas.microsoft.com/office/drawing/2016/5/12/chartex" xmlns:cx7="http://schemas.microsoft.com/office/drawing/2016/5/13/chartex" xmlns:cx8="http://schemas.microsoft.com/office/drawing/2016/5/14/chartex" xmlns:mc="http://schemas.openxmlformats.org/markup-compatibility/2006" xmlns:aink="http://schemas.microsoft.com/office/drawing/2016/ink" xmlns:am3d="http://schemas.microsoft.com/office/drawing/2017/model3d" xmlns:o="urn:schemas-microsoft-com:office:office" xmlns:oel="http://schemas.microsoft.com/office/2019/extlst" xmlns:r="http://schemas.openxmlformats.org/officeDocument/2006/relationships" xmlns:m="http://schemas.openxmlformats.org/officeDocument/2006/math" xmlns:v="urn:schemas-microsoft-com:vml" xmlns:wp14="http://schemas.microsoft.com/office/word/2010/wordprocessingDrawing" xmlns:wp="http://schemas.openxmlformats.org/drawingml/2006/wordprocessingDrawing" xmlns:w10="urn:schemas-microsoft-com:office:word" xmlns:w="http://schemas.openxmlformats.org/wordprocessingml/2006/main" xmlns:w14="http://schemas.microsoft.com/office/word/2010/wordml" xmlns:w15="http://schemas.microsoft.com/office/word/2012/wordml" xmlns:w16cex="http://schemas.microsoft.com/office/word/2018/wordml/cex" xmlns:w16cid="http://schemas.microsoft.com/office/word/2016/wordml/cid" xmlns:w16="http://schemas.microsoft.com/office/word/2018/wordml" xmlns:w16du="http://schemas.microsoft.com/office/word/2023/wordml/word16du" xmlns:w16sdtdh="http://schemas.microsoft.com/office/word/2020/wordml/sdtdatahash" xmlns:w16sdtfl="http://schemas.microsoft.com/office/word/2024/wordml/sdtformatlock" xmlns:w16se="http://schemas.microsoft.com/office/word/2015/wordml/symex" xmlns:wpg="http://schemas.microsoft.com/office/word/2010/wordprocessingGroup" xmlns:wpi="http://schemas.microsoft.com/office/word/2010/wordprocessingInk" xmlns:wne="http://schemas.microsoft.com/office/word/2006/wordml" xmlns:wps="http://schemas.microsoft.com/office/word/2010/wordprocessingShape" mc:Ignorable="w14 w15 w16se w16cid w16 w16cex w16sdtdh w16sdtfl w16du wp14">
+<w:endnotes xmlns:wpc="http://schemas.microsoft.com/office/word/2010/wordprocessingCanvas" xmlns:cx="http://schemas.microsoft.com/office/drawing/2014/chartex" xmlns:cx1="http://schemas.microsoft.com/office/drawing/2015/9/8/chartex" xmlns:mc="http://schemas.openxmlformats.org/markup-compatibility/2006" xmlns:o="urn:schemas-microsoft-com:office:office" xmlns:r="http://schemas.openxmlformats.org/officeDocument/2006/relationships" xmlns:m="http://schemas.openxmlformats.org/officeDocument/2006/math" xmlns:v="urn:schemas-microsoft-com:vml" xmlns:wp14="http://schemas.microsoft.com/office/word/2010/wordprocessingDrawing" xmlns:wp="http://schemas.openxmlformats.org/drawingml/2006/wordprocessingDrawing" xmlns:w10="urn:schemas-microsoft-com:office:word" xmlns:w="http://schemas.openxmlformats.org/wordprocessingml/2006/main" xmlns:w14="http://schemas.microsoft.com/office/word/2010/wordml" xmlns:w15="http://schemas.microsoft.com/office/word/2012/wordml" xmlns:w16se="http://schemas.microsoft.com/office/word/2015/wordml/symex" xmlns:wpg="http://schemas.microsoft.com/office/word/2010/wordprocessingGroup" xmlns:wpi="http://schemas.microsoft.com/office/word/2010/wordprocessingInk" xmlns:wne="http://schemas.microsoft.com/office/word/2006/wordml" xmlns:wps="http://schemas.microsoft.com/office/word/2010/wordprocessingShape" mc:Ignorable="w14 w15 w16se wp14">
   <w:endnote w:type="separator" w:id="-1">
     <w:p>
       <w:pPr>
@@ -15204,7 +15306,7 @@
 </file>
 
 <file path=word/footer1.xml><?xml version="1.0" encoding="utf-8"?>
-<w:ftr xmlns:wpc="http://schemas.microsoft.com/office/word/2010/wordprocessingCanvas" xmlns:cx="http://schemas.microsoft.com/office/drawing/2014/chartex" xmlns:cx1="http://schemas.microsoft.com/office/drawing/2015/9/8/chartex" xmlns:cx2="http://schemas.microsoft.com/office/drawing/2015/10/21/chartex" xmlns:cx3="http://schemas.microsoft.com/office/drawing/2016/5/9/chartex" xmlns:cx4="http://schemas.microsoft.com/office/drawing/2016/5/10/chartex" xmlns:cx5="http://schemas.microsoft.com/office/drawing/2016/5/11/chartex" xmlns:cx6="http://schemas.microsoft.com/office/drawing/2016/5/12/chartex" xmlns:cx7="http://schemas.microsoft.com/office/drawing/2016/5/13/chartex" xmlns:cx8="http://schemas.microsoft.com/office/drawing/2016/5/14/chartex" xmlns:mc="http://schemas.openxmlformats.org/markup-compatibility/2006" xmlns:aink="http://schemas.microsoft.com/office/drawing/2016/ink" xmlns:am3d="http://schemas.microsoft.com/office/drawing/2017/model3d" xmlns:o="urn:schemas-microsoft-com:office:office" xmlns:oel="http://schemas.microsoft.com/office/2019/extlst" xmlns:r="http://schemas.openxmlformats.org/officeDocument/2006/relationships" xmlns:m="http://schemas.openxmlformats.org/officeDocument/2006/math" xmlns:v="urn:schemas-microsoft-com:vml" xmlns:wp14="http://schemas.microsoft.com/office/word/2010/wordprocessingDrawing" xmlns:wp="http://schemas.openxmlformats.org/drawingml/2006/wordprocessingDrawing" xmlns:w10="urn:schemas-microsoft-com:office:word" xmlns:w="http://schemas.openxmlformats.org/wordprocessingml/2006/main" xmlns:w14="http://schemas.microsoft.com/office/word/2010/wordml" xmlns:w15="http://schemas.microsoft.com/office/word/2012/wordml" xmlns:w16cex="http://schemas.microsoft.com/office/word/2018/wordml/cex" xmlns:w16cid="http://schemas.microsoft.com/office/word/2016/wordml/cid" xmlns:w16="http://schemas.microsoft.com/office/word/2018/wordml" xmlns:w16du="http://schemas.microsoft.com/office/word/2023/wordml/word16du" xmlns:w16sdtdh="http://schemas.microsoft.com/office/word/2020/wordml/sdtdatahash" xmlns:w16sdtfl="http://schemas.microsoft.com/office/word/2024/wordml/sdtformatlock" xmlns:w16se="http://schemas.microsoft.com/office/word/2015/wordml/symex" xmlns:wpg="http://schemas.microsoft.com/office/word/2010/wordprocessingGroup" xmlns:wpi="http://schemas.microsoft.com/office/word/2010/wordprocessingInk" xmlns:wne="http://schemas.microsoft.com/office/word/2006/wordml" xmlns:wps="http://schemas.microsoft.com/office/word/2010/wordprocessingShape" mc:Ignorable="w14 w15 w16se w16cid w16 w16cex w16sdtdh w16sdtfl w16du wp14">
+<w:ftr xmlns:wpc="http://schemas.microsoft.com/office/word/2010/wordprocessingCanvas" xmlns:cx="http://schemas.microsoft.com/office/drawing/2014/chartex" xmlns:cx1="http://schemas.microsoft.com/office/drawing/2015/9/8/chartex" xmlns:mc="http://schemas.openxmlformats.org/markup-compatibility/2006" xmlns:o="urn:schemas-microsoft-com:office:office" xmlns:r="http://schemas.openxmlformats.org/officeDocument/2006/relationships" xmlns:m="http://schemas.openxmlformats.org/officeDocument/2006/math" xmlns:v="urn:schemas-microsoft-com:vml" xmlns:wp14="http://schemas.microsoft.com/office/word/2010/wordprocessingDrawing" xmlns:wp="http://schemas.openxmlformats.org/drawingml/2006/wordprocessingDrawing" xmlns:w10="urn:schemas-microsoft-com:office:word" xmlns:w="http://schemas.openxmlformats.org/wordprocessingml/2006/main" xmlns:w14="http://schemas.microsoft.com/office/word/2010/wordml" xmlns:w15="http://schemas.microsoft.com/office/word/2012/wordml" xmlns:w16se="http://schemas.microsoft.com/office/word/2015/wordml/symex" xmlns:wpg="http://schemas.microsoft.com/office/word/2010/wordprocessingGroup" xmlns:wpi="http://schemas.microsoft.com/office/word/2010/wordprocessingInk" xmlns:wne="http://schemas.microsoft.com/office/word/2006/wordml" xmlns:wps="http://schemas.microsoft.com/office/word/2010/wordprocessingShape" mc:Ignorable="w14 w15 w16se wp14">
   <w:p>
     <w:pPr>
       <w:pBdr>
@@ -15310,7 +15412,7 @@
             </wp:anchor>
           </w:drawing>
         </mc:Choice>
-        <mc:Fallback xmlns:sl="http://schemas.openxmlformats.org/schemaLibrary/2006/main" xmlns:a="http://schemas.openxmlformats.org/drawingml/2006/main" xmlns:pic="http://schemas.openxmlformats.org/drawingml/2006/picture" xmlns:c="http://schemas.openxmlformats.org/drawingml/2006/chart" xmlns:lc="http://schemas.openxmlformats.org/drawingml/2006/lockedCanvas" xmlns:dgm="http://schemas.openxmlformats.org/drawingml/2006/diagram" xmlns="http://schemas.microsoft.com/office/tasks/2019/documenttasks" xmlns:cr="http://schemas.microsoft.com/office/comments/2020/reactions">
+        <mc:Fallback xmlns:cr="http://schemas.microsoft.com/office/comments/2020/reactions" xmlns="http://schemas.microsoft.com/office/tasks/2019/documenttasks" xmlns:dgm="http://schemas.openxmlformats.org/drawingml/2006/diagram" xmlns:lc="http://schemas.openxmlformats.org/drawingml/2006/lockedCanvas" xmlns:c="http://schemas.openxmlformats.org/drawingml/2006/chart" xmlns:pic="http://schemas.openxmlformats.org/drawingml/2006/picture" xmlns:a="http://schemas.openxmlformats.org/drawingml/2006/main" xmlns:sl="http://schemas.openxmlformats.org/schemaLibrary/2006/main" xmlns:w16sdtfl="http://schemas.microsoft.com/office/word/2024/wordml/sdtformatlock" xmlns:w16sdtdh="http://schemas.microsoft.com/office/word/2020/wordml/sdtdatahash" xmlns:w16du="http://schemas.microsoft.com/office/word/2023/wordml/word16du" xmlns:w16="http://schemas.microsoft.com/office/word/2018/wordml" xmlns:w16cid="http://schemas.microsoft.com/office/word/2016/wordml/cid" xmlns:w16cex="http://schemas.microsoft.com/office/word/2018/wordml/cex" xmlns:oel="http://schemas.microsoft.com/office/2019/extlst" xmlns:am3d="http://schemas.microsoft.com/office/drawing/2017/model3d" xmlns:aink="http://schemas.microsoft.com/office/drawing/2016/ink" xmlns:cx8="http://schemas.microsoft.com/office/drawing/2016/5/14/chartex" xmlns:cx7="http://schemas.microsoft.com/office/drawing/2016/5/13/chartex" xmlns:cx6="http://schemas.microsoft.com/office/drawing/2016/5/12/chartex" xmlns:cx5="http://schemas.microsoft.com/office/drawing/2016/5/11/chartex" xmlns:cx4="http://schemas.microsoft.com/office/drawing/2016/5/10/chartex" xmlns:cx3="http://schemas.microsoft.com/office/drawing/2016/5/9/chartex" xmlns:cx2="http://schemas.microsoft.com/office/drawing/2015/10/21/chartex">
           <w:drawing>
             <wp:anchor allowOverlap="1" behindDoc="0" distB="4294967295" distT="4294967295" distL="114300" distR="114300" hidden="0" layoutInCell="1" locked="0" relativeHeight="0" simplePos="0">
               <wp:simplePos x="0" y="0"/>
@@ -15359,7 +15461,7 @@
 </file>
 
 <file path=word/footnotes.xml><?xml version="1.0" encoding="utf-8"?>
-<w:footnotes xmlns:wpc="http://schemas.microsoft.com/office/word/2010/wordprocessingCanvas" xmlns:cx="http://schemas.microsoft.com/office/drawing/2014/chartex" xmlns:cx1="http://schemas.microsoft.com/office/drawing/2015/9/8/chartex" xmlns:cx2="http://schemas.microsoft.com/office/drawing/2015/10/21/chartex" xmlns:cx3="http://schemas.microsoft.com/office/drawing/2016/5/9/chartex" xmlns:cx4="http://schemas.microsoft.com/office/drawing/2016/5/10/chartex" xmlns:cx5="http://schemas.microsoft.com/office/drawing/2016/5/11/chartex" xmlns:cx6="http://schemas.microsoft.com/office/drawing/2016/5/12/chartex" xmlns:cx7="http://schemas.microsoft.com/office/drawing/2016/5/13/chartex" xmlns:cx8="http://schemas.microsoft.com/office/drawing/2016/5/14/chartex" xmlns:mc="http://schemas.openxmlformats.org/markup-compatibility/2006" xmlns:aink="http://schemas.microsoft.com/office/drawing/2016/ink" xmlns:am3d="http://schemas.microsoft.com/office/drawing/2017/model3d" xmlns:o="urn:schemas-microsoft-com:office:office" xmlns:oel="http://schemas.microsoft.com/office/2019/extlst" xmlns:r="http://schemas.openxmlformats.org/officeDocument/2006/relationships" xmlns:m="http://schemas.openxmlformats.org/officeDocument/2006/math" xmlns:v="urn:schemas-microsoft-com:vml" xmlns:wp14="http://schemas.microsoft.com/office/word/2010/wordprocessingDrawing" xmlns:wp="http://schemas.openxmlformats.org/drawingml/2006/wordprocessingDrawing" xmlns:w10="urn:schemas-microsoft-com:office:word" xmlns:w="http://schemas.openxmlformats.org/wordprocessingml/2006/main" xmlns:w14="http://schemas.microsoft.com/office/word/2010/wordml" xmlns:w15="http://schemas.microsoft.com/office/word/2012/wordml" xmlns:w16cex="http://schemas.microsoft.com/office/word/2018/wordml/cex" xmlns:w16cid="http://schemas.microsoft.com/office/word/2016/wordml/cid" xmlns:w16="http://schemas.microsoft.com/office/word/2018/wordml" xmlns:w16du="http://schemas.microsoft.com/office/word/2023/wordml/word16du" xmlns:w16sdtdh="http://schemas.microsoft.com/office/word/2020/wordml/sdtdatahash" xmlns:w16sdtfl="http://schemas.microsoft.com/office/word/2024/wordml/sdtformatlock" xmlns:w16se="http://schemas.microsoft.com/office/word/2015/wordml/symex" xmlns:wpg="http://schemas.microsoft.com/office/word/2010/wordprocessingGroup" xmlns:wpi="http://schemas.microsoft.com/office/word/2010/wordprocessingInk" xmlns:wne="http://schemas.microsoft.com/office/word/2006/wordml" xmlns:wps="http://schemas.microsoft.com/office/word/2010/wordprocessingShape" mc:Ignorable="w14 w15 w16se w16cid w16 w16cex w16sdtdh w16sdtfl w16du wp14">
+<w:footnotes xmlns:wpc="http://schemas.microsoft.com/office/word/2010/wordprocessingCanvas" xmlns:cx="http://schemas.microsoft.com/office/drawing/2014/chartex" xmlns:cx1="http://schemas.microsoft.com/office/drawing/2015/9/8/chartex" xmlns:mc="http://schemas.openxmlformats.org/markup-compatibility/2006" xmlns:o="urn:schemas-microsoft-com:office:office" xmlns:r="http://schemas.openxmlformats.org/officeDocument/2006/relationships" xmlns:m="http://schemas.openxmlformats.org/officeDocument/2006/math" xmlns:v="urn:schemas-microsoft-com:vml" xmlns:wp14="http://schemas.microsoft.com/office/word/2010/wordprocessingDrawing" xmlns:wp="http://schemas.openxmlformats.org/drawingml/2006/wordprocessingDrawing" xmlns:w10="urn:schemas-microsoft-com:office:word" xmlns:w="http://schemas.openxmlformats.org/wordprocessingml/2006/main" xmlns:w14="http://schemas.microsoft.com/office/word/2010/wordml" xmlns:w15="http://schemas.microsoft.com/office/word/2012/wordml" xmlns:w16se="http://schemas.microsoft.com/office/word/2015/wordml/symex" xmlns:wpg="http://schemas.microsoft.com/office/word/2010/wordprocessingGroup" xmlns:wpi="http://schemas.microsoft.com/office/word/2010/wordprocessingInk" xmlns:wne="http://schemas.microsoft.com/office/word/2006/wordml" xmlns:wps="http://schemas.microsoft.com/office/word/2010/wordprocessingShape" mc:Ignorable="w14 w15 w16se wp14">
   <w:footnote w:type="separator" w:id="-1">
     <w:p>
       <w:pPr>
@@ -15384,7 +15486,7 @@
 </file>
 
 <file path=word/header1.xml><?xml version="1.0" encoding="utf-8"?>
-<w:hdr xmlns:wpc="http://schemas.microsoft.com/office/word/2010/wordprocessingCanvas" xmlns:cx="http://schemas.microsoft.com/office/drawing/2014/chartex" xmlns:cx1="http://schemas.microsoft.com/office/drawing/2015/9/8/chartex" xmlns:cx2="http://schemas.microsoft.com/office/drawing/2015/10/21/chartex" xmlns:cx3="http://schemas.microsoft.com/office/drawing/2016/5/9/chartex" xmlns:cx4="http://schemas.microsoft.com/office/drawing/2016/5/10/chartex" xmlns:cx5="http://schemas.microsoft.com/office/drawing/2016/5/11/chartex" xmlns:cx6="http://schemas.microsoft.com/office/drawing/2016/5/12/chartex" xmlns:cx7="http://schemas.microsoft.com/office/drawing/2016/5/13/chartex" xmlns:cx8="http://schemas.microsoft.com/office/drawing/2016/5/14/chartex" xmlns:mc="http://schemas.openxmlformats.org/markup-compatibility/2006" xmlns:aink="http://schemas.microsoft.com/office/drawing/2016/ink" xmlns:am3d="http://schemas.microsoft.com/office/drawing/2017/model3d" xmlns:o="urn:schemas-microsoft-com:office:office" xmlns:oel="http://schemas.microsoft.com/office/2019/extlst" xmlns:r="http://schemas.openxmlformats.org/officeDocument/2006/relationships" xmlns:m="http://schemas.openxmlformats.org/officeDocument/2006/math" xmlns:v="urn:schemas-microsoft-com:vml" xmlns:wp14="http://schemas.microsoft.com/office/word/2010/wordprocessingDrawing" xmlns:wp="http://schemas.openxmlformats.org/drawingml/2006/wordprocessingDrawing" xmlns:w10="urn:schemas-microsoft-com:office:word" xmlns:w="http://schemas.openxmlformats.org/wordprocessingml/2006/main" xmlns:w14="http://schemas.microsoft.com/office/word/2010/wordml" xmlns:w15="http://schemas.microsoft.com/office/word/2012/wordml" xmlns:w16cex="http://schemas.microsoft.com/office/word/2018/wordml/cex" xmlns:w16cid="http://schemas.microsoft.com/office/word/2016/wordml/cid" xmlns:w16="http://schemas.microsoft.com/office/word/2018/wordml" xmlns:w16du="http://schemas.microsoft.com/office/word/2023/wordml/word16du" xmlns:w16sdtdh="http://schemas.microsoft.com/office/word/2020/wordml/sdtdatahash" xmlns:w16sdtfl="http://schemas.microsoft.com/office/word/2024/wordml/sdtformatlock" xmlns:w16se="http://schemas.microsoft.com/office/word/2015/wordml/symex" xmlns:wpg="http://schemas.microsoft.com/office/word/2010/wordprocessingGroup" xmlns:wpi="http://schemas.microsoft.com/office/word/2010/wordprocessingInk" xmlns:wne="http://schemas.microsoft.com/office/word/2006/wordml" xmlns:wps="http://schemas.microsoft.com/office/word/2010/wordprocessingShape" mc:Ignorable="w14 w15 w16se w16cid w16 w16cex w16sdtdh w16sdtfl w16du wp14">
+<w:hdr xmlns:wpc="http://schemas.microsoft.com/office/word/2010/wordprocessingCanvas" xmlns:cx="http://schemas.microsoft.com/office/drawing/2014/chartex" xmlns:cx1="http://schemas.microsoft.com/office/drawing/2015/9/8/chartex" xmlns:mc="http://schemas.openxmlformats.org/markup-compatibility/2006" xmlns:o="urn:schemas-microsoft-com:office:office" xmlns:r="http://schemas.openxmlformats.org/officeDocument/2006/relationships" xmlns:m="http://schemas.openxmlformats.org/officeDocument/2006/math" xmlns:v="urn:schemas-microsoft-com:vml" xmlns:wp14="http://schemas.microsoft.com/office/word/2010/wordprocessingDrawing" xmlns:wp="http://schemas.openxmlformats.org/drawingml/2006/wordprocessingDrawing" xmlns:w10="urn:schemas-microsoft-com:office:word" xmlns:w="http://schemas.openxmlformats.org/wordprocessingml/2006/main" xmlns:w14="http://schemas.microsoft.com/office/word/2010/wordml" xmlns:w15="http://schemas.microsoft.com/office/word/2012/wordml" xmlns:w16se="http://schemas.microsoft.com/office/word/2015/wordml/symex" xmlns:wpg="http://schemas.microsoft.com/office/word/2010/wordprocessingGroup" xmlns:wpi="http://schemas.microsoft.com/office/word/2010/wordprocessingInk" xmlns:wne="http://schemas.microsoft.com/office/word/2006/wordml" xmlns:wps="http://schemas.microsoft.com/office/word/2010/wordprocessingShape" mc:Ignorable="w14 w15 w16se wp14">
   <w:p>
     <w:pPr>
       <w:jc w:val="right"/>
@@ -15425,7 +15527,7 @@
         <w:sz w:val="24"/>
         <w:szCs w:val="24"/>
       </w:rPr>
-      <w:t>2</w:t>
+      <w:t>17</w:t>
     </w:r>
     <w:r>
       <w:rPr>
@@ -15461,7 +15563,7 @@
 </file>
 
 <file path=word/numbering.xml><?xml version="1.0" encoding="utf-8"?>
-<w:numbering xmlns:wpc="http://schemas.microsoft.com/office/word/2010/wordprocessingCanvas" xmlns:cx="http://schemas.microsoft.com/office/drawing/2014/chartex" xmlns:cx1="http://schemas.microsoft.com/office/drawing/2015/9/8/chartex" xmlns:cx2="http://schemas.microsoft.com/office/drawing/2015/10/21/chartex" xmlns:cx3="http://schemas.microsoft.com/office/drawing/2016/5/9/chartex" xmlns:cx4="http://schemas.microsoft.com/office/drawing/2016/5/10/chartex" xmlns:cx5="http://schemas.microsoft.com/office/drawing/2016/5/11/chartex" xmlns:cx6="http://schemas.microsoft.com/office/drawing/2016/5/12/chartex" xmlns:cx7="http://schemas.microsoft.com/office/drawing/2016/5/13/chartex" xmlns:cx8="http://schemas.microsoft.com/office/drawing/2016/5/14/chartex" xmlns:mc="http://schemas.openxmlformats.org/markup-compatibility/2006" xmlns:aink="http://schemas.microsoft.com/office/drawing/2016/ink" xmlns:am3d="http://schemas.microsoft.com/office/drawing/2017/model3d" xmlns:o="urn:schemas-microsoft-com:office:office" xmlns:oel="http://schemas.microsoft.com/office/2019/extlst" xmlns:r="http://schemas.openxmlformats.org/officeDocument/2006/relationships" xmlns:m="http://schemas.openxmlformats.org/officeDocument/2006/math" xmlns:v="urn:schemas-microsoft-com:vml" xmlns:wp14="http://schemas.microsoft.com/office/word/2010/wordprocessingDrawing" xmlns:wp="http://schemas.openxmlformats.org/drawingml/2006/wordprocessingDrawing" xmlns:w10="urn:schemas-microsoft-com:office:word" xmlns:w="http://schemas.openxmlformats.org/wordprocessingml/2006/main" xmlns:w14="http://schemas.microsoft.com/office/word/2010/wordml" xmlns:w15="http://schemas.microsoft.com/office/word/2012/wordml" xmlns:w16cex="http://schemas.microsoft.com/office/word/2018/wordml/cex" xmlns:w16cid="http://schemas.microsoft.com/office/word/2016/wordml/cid" xmlns:w16="http://schemas.microsoft.com/office/word/2018/wordml" xmlns:w16du="http://schemas.microsoft.com/office/word/2023/wordml/word16du" xmlns:w16sdtdh="http://schemas.microsoft.com/office/word/2020/wordml/sdtdatahash" xmlns:w16sdtfl="http://schemas.microsoft.com/office/word/2024/wordml/sdtformatlock" xmlns:w16se="http://schemas.microsoft.com/office/word/2015/wordml/symex" xmlns:wpg="http://schemas.microsoft.com/office/word/2010/wordprocessingGroup" xmlns:wpi="http://schemas.microsoft.com/office/word/2010/wordprocessingInk" xmlns:wne="http://schemas.microsoft.com/office/word/2006/wordml" xmlns:wps="http://schemas.microsoft.com/office/word/2010/wordprocessingShape" mc:Ignorable="w14 w15 w16se w16cid w16 w16cex w16sdtdh w16sdtfl w16du wp14">
+<w:numbering xmlns:wpc="http://schemas.microsoft.com/office/word/2010/wordprocessingCanvas" xmlns:cx="http://schemas.microsoft.com/office/drawing/2014/chartex" xmlns:cx1="http://schemas.microsoft.com/office/drawing/2015/9/8/chartex" xmlns:mc="http://schemas.openxmlformats.org/markup-compatibility/2006" xmlns:o="urn:schemas-microsoft-com:office:office" xmlns:r="http://schemas.openxmlformats.org/officeDocument/2006/relationships" xmlns:m="http://schemas.openxmlformats.org/officeDocument/2006/math" xmlns:v="urn:schemas-microsoft-com:vml" xmlns:wp14="http://schemas.microsoft.com/office/word/2010/wordprocessingDrawing" xmlns:wp="http://schemas.openxmlformats.org/drawingml/2006/wordprocessingDrawing" xmlns:w10="urn:schemas-microsoft-com:office:word" xmlns:w="http://schemas.openxmlformats.org/wordprocessingml/2006/main" xmlns:w14="http://schemas.microsoft.com/office/word/2010/wordml" xmlns:w15="http://schemas.microsoft.com/office/word/2012/wordml" xmlns:w16se="http://schemas.microsoft.com/office/word/2015/wordml/symex" xmlns:wpg="http://schemas.microsoft.com/office/word/2010/wordprocessingGroup" xmlns:wpi="http://schemas.microsoft.com/office/word/2010/wordprocessingInk" xmlns:wne="http://schemas.microsoft.com/office/word/2006/wordml" xmlns:wps="http://schemas.microsoft.com/office/word/2010/wordprocessingShape" mc:Ignorable="w14 w15 w16se wp14">
   <w:abstractNum w:abstractNumId="0" w15:restartNumberingAfterBreak="0">
     <w:nsid w:val="00000002"/>
     <w:multiLevelType w:val="multilevel"/>
@@ -16798,47 +16900,47 @@
       </w:pPr>
     </w:lvl>
   </w:abstractNum>
-  <w:num w:numId="1" w16cid:durableId="109863628">
+  <w:num w:numId="1">
     <w:abstractNumId w:val="1"/>
   </w:num>
-  <w:num w:numId="2" w16cid:durableId="79329343">
+  <w:num w:numId="2">
     <w:abstractNumId w:val="3"/>
   </w:num>
-  <w:num w:numId="3" w16cid:durableId="1573466001">
+  <w:num w:numId="3">
     <w:abstractNumId w:val="4"/>
   </w:num>
-  <w:num w:numId="4" w16cid:durableId="290868040">
+  <w:num w:numId="4">
     <w:abstractNumId w:val="9"/>
   </w:num>
-  <w:num w:numId="5" w16cid:durableId="2034188490">
+  <w:num w:numId="5">
     <w:abstractNumId w:val="8"/>
   </w:num>
-  <w:num w:numId="6" w16cid:durableId="1101946727">
+  <w:num w:numId="6">
     <w:abstractNumId w:val="6"/>
   </w:num>
-  <w:num w:numId="7" w16cid:durableId="1969971178">
+  <w:num w:numId="7">
     <w:abstractNumId w:val="5"/>
   </w:num>
-  <w:num w:numId="8" w16cid:durableId="393159177">
+  <w:num w:numId="8">
     <w:abstractNumId w:val="0"/>
   </w:num>
-  <w:num w:numId="9" w16cid:durableId="1888957348">
+  <w:num w:numId="9">
     <w:abstractNumId w:val="11"/>
   </w:num>
-  <w:num w:numId="10" w16cid:durableId="61026983">
+  <w:num w:numId="10">
     <w:abstractNumId w:val="10"/>
   </w:num>
-  <w:num w:numId="11" w16cid:durableId="741408944">
+  <w:num w:numId="11">
     <w:abstractNumId w:val="2"/>
   </w:num>
-  <w:num w:numId="12" w16cid:durableId="1171019366">
+  <w:num w:numId="12">
     <w:abstractNumId w:val="7"/>
   </w:num>
 </w:numbering>
 </file>
 
 <file path=word/styles.xml><?xml version="1.0" encoding="utf-8"?>
-<w:styles xmlns:mc="http://schemas.openxmlformats.org/markup-compatibility/2006" xmlns:r="http://schemas.openxmlformats.org/officeDocument/2006/relationships" xmlns:w="http://schemas.openxmlformats.org/wordprocessingml/2006/main" xmlns:w14="http://schemas.microsoft.com/office/word/2010/wordml" xmlns:w15="http://schemas.microsoft.com/office/word/2012/wordml" xmlns:w16cex="http://schemas.microsoft.com/office/word/2018/wordml/cex" xmlns:w16cid="http://schemas.microsoft.com/office/word/2016/wordml/cid" xmlns:w16="http://schemas.microsoft.com/office/word/2018/wordml" xmlns:w16du="http://schemas.microsoft.com/office/word/2023/wordml/word16du" xmlns:w16sdtdh="http://schemas.microsoft.com/office/word/2020/wordml/sdtdatahash" xmlns:w16sdtfl="http://schemas.microsoft.com/office/word/2024/wordml/sdtformatlock" xmlns:w16se="http://schemas.microsoft.com/office/word/2015/wordml/symex" mc:Ignorable="w14 w15 w16se w16cid w16 w16cex w16sdtdh w16sdtfl w16du">
+<w:styles xmlns:mc="http://schemas.openxmlformats.org/markup-compatibility/2006" xmlns:r="http://schemas.openxmlformats.org/officeDocument/2006/relationships" xmlns:w="http://schemas.openxmlformats.org/wordprocessingml/2006/main" xmlns:w14="http://schemas.microsoft.com/office/word/2010/wordml" xmlns:w15="http://schemas.microsoft.com/office/word/2012/wordml" xmlns:w16se="http://schemas.microsoft.com/office/word/2015/wordml/symex" mc:Ignorable="w14 w15 w16se">
   <w:docDefaults>
     <w:rPrDefault>
       <w:rPr>
@@ -16854,7 +16956,7 @@
       </w:pPr>
     </w:pPrDefault>
   </w:docDefaults>
-  <w:latentStyles w:defLockedState="0" w:defUIPriority="99" w:defSemiHidden="0" w:defUnhideWhenUsed="0" w:defQFormat="0" w:count="376">
+  <w:latentStyles w:defLockedState="0" w:defUIPriority="99" w:defSemiHidden="0" w:defUnhideWhenUsed="0" w:defQFormat="0" w:count="371">
     <w:lsdException w:name="Normal" w:uiPriority="0" w:qFormat="1"/>
     <w:lsdException w:name="heading 1" w:uiPriority="9" w:qFormat="1"/>
     <w:lsdException w:name="heading 2" w:semiHidden="1" w:uiPriority="9" w:unhideWhenUsed="1" w:qFormat="1"/>
@@ -17226,11 +17328,6 @@
     <w:lsdException w:name="List Table 5 Dark Accent 6" w:uiPriority="50"/>
     <w:lsdException w:name="List Table 6 Colorful Accent 6" w:uiPriority="51"/>
     <w:lsdException w:name="List Table 7 Colorful Accent 6" w:uiPriority="52"/>
-    <w:lsdException w:name="Mention" w:semiHidden="1" w:unhideWhenUsed="1"/>
-    <w:lsdException w:name="Smart Hyperlink" w:semiHidden="1" w:unhideWhenUsed="1"/>
-    <w:lsdException w:name="Hashtag" w:semiHidden="1" w:unhideWhenUsed="1"/>
-    <w:lsdException w:name="Unresolved Mention" w:semiHidden="1" w:unhideWhenUsed="1"/>
-    <w:lsdException w:name="Smart Link" w:semiHidden="1" w:unhideWhenUsed="1"/>
   </w:latentStyles>
   <w:style w:type="paragraph" w:default="1" w:styleId="Normal">
     <w:name w:val="Normal"/>
@@ -21567,7 +21664,7 @@
       </w:tblCellMar>
     </w:tblPr>
   </w:style>
-  <w:style w:type="character" w:styleId="MenoPendente">
+  <w:style w:type="character" w:customStyle="1" w:styleId="UnresolvedMention">
     <w:name w:val="Unresolved Mention"/>
     <w:basedOn w:val="Fontepargpadro"/>
     <w:uiPriority w:val="99"/>

</xml_diff>